<commit_message>
Add actual content to literature survey
</commit_message>
<xml_diff>
--- a/docs/Literature_Survey_draft.docx
+++ b/docs/Literature_Survey_draft.docx
@@ -4,29 +4,377 @@
   <w:body>
     <w:p>
       <w:pPr>
-        <w:pStyle w:val="ds-markdown-paragraph"/>
-        <w:shd w:val="clear" w:color="auto" w:fill="FFFFFF"/>
-        <w:spacing w:before="240" w:beforeAutospacing="0" w:after="240" w:afterAutospacing="0"/>
-        <w:rPr>
-          <w:rFonts w:ascii="Arial" w:hAnsi="Arial" w:cs="Arial"/>
-          <w:color w:val="0F1115"/>
+        <w:tabs>
+          <w:tab w:val="left" w:pos="916"/>
+          <w:tab w:val="left" w:pos="1832"/>
+          <w:tab w:val="left" w:pos="2748"/>
+          <w:tab w:val="left" w:pos="3664"/>
+          <w:tab w:val="left" w:pos="4580"/>
+          <w:tab w:val="left" w:pos="5496"/>
+          <w:tab w:val="left" w:pos="6412"/>
+          <w:tab w:val="left" w:pos="7328"/>
+          <w:tab w:val="left" w:pos="8244"/>
+          <w:tab w:val="left" w:pos="9160"/>
+          <w:tab w:val="left" w:pos="10076"/>
+          <w:tab w:val="left" w:pos="10992"/>
+          <w:tab w:val="left" w:pos="11908"/>
+          <w:tab w:val="left" w:pos="12824"/>
+          <w:tab w:val="left" w:pos="13740"/>
+          <w:tab w:val="left" w:pos="14656"/>
+        </w:tabs>
+        <w:wordWrap w:val="0"/>
+        <w:rPr>
+          <w:rFonts w:ascii="var(--ds-font-family-code)" w:eastAsia="Times New Roman" w:hAnsi="var(--ds-font-family-code)" w:cs="Courier New"/>
+          <w:color w:val="0F1115"/>
+          <w:sz w:val="20"/>
+          <w:szCs w:val="20"/>
+          <w:lang w:eastAsia="en-GB"/>
         </w:rPr>
       </w:pPr>
       <w:r>
         <w:rPr>
-          <w:rStyle w:val="Strong"/>
-          <w:rFonts w:ascii="Arial" w:hAnsi="Arial" w:cs="Arial"/>
-          <w:color w:val="0F1115"/>
-        </w:rPr>
-        <w:t>1</w:t>
+          <w:rFonts w:ascii="var(--ds-font-family-code)" w:eastAsia="Times New Roman" w:hAnsi="var(--ds-font-family-code)" w:cs="Courier New"/>
+          <w:color w:val="0F1115"/>
+          <w:sz w:val="20"/>
+          <w:szCs w:val="20"/>
+          <w:lang w:eastAsia="en-GB"/>
+        </w:rPr>
+        <w:t>Literature Survey</w:t>
+      </w:r>
+    </w:p>
+    <w:p>
+      <w:pPr>
+        <w:tabs>
+          <w:tab w:val="left" w:pos="916"/>
+          <w:tab w:val="left" w:pos="1832"/>
+          <w:tab w:val="left" w:pos="2748"/>
+          <w:tab w:val="left" w:pos="3664"/>
+          <w:tab w:val="left" w:pos="4580"/>
+          <w:tab w:val="left" w:pos="5496"/>
+          <w:tab w:val="left" w:pos="6412"/>
+          <w:tab w:val="left" w:pos="7328"/>
+          <w:tab w:val="left" w:pos="8244"/>
+          <w:tab w:val="left" w:pos="9160"/>
+          <w:tab w:val="left" w:pos="10076"/>
+          <w:tab w:val="left" w:pos="10992"/>
+          <w:tab w:val="left" w:pos="11908"/>
+          <w:tab w:val="left" w:pos="12824"/>
+          <w:tab w:val="left" w:pos="13740"/>
+          <w:tab w:val="left" w:pos="14656"/>
+        </w:tabs>
+        <w:wordWrap w:val="0"/>
+        <w:rPr>
+          <w:rFonts w:ascii="var(--ds-font-family-code)" w:eastAsia="Times New Roman" w:hAnsi="var(--ds-font-family-code)" w:cs="Courier New"/>
+          <w:color w:val="0F1115"/>
+          <w:sz w:val="20"/>
+          <w:szCs w:val="20"/>
+          <w:lang w:eastAsia="en-GB"/>
+        </w:rPr>
+      </w:pPr>
+    </w:p>
+    <w:p>
+      <w:pPr>
+        <w:tabs>
+          <w:tab w:val="left" w:pos="916"/>
+          <w:tab w:val="left" w:pos="1832"/>
+          <w:tab w:val="left" w:pos="2748"/>
+          <w:tab w:val="left" w:pos="3664"/>
+          <w:tab w:val="left" w:pos="4580"/>
+          <w:tab w:val="left" w:pos="5496"/>
+          <w:tab w:val="left" w:pos="6412"/>
+          <w:tab w:val="left" w:pos="7328"/>
+          <w:tab w:val="left" w:pos="8244"/>
+          <w:tab w:val="left" w:pos="9160"/>
+          <w:tab w:val="left" w:pos="10076"/>
+          <w:tab w:val="left" w:pos="10992"/>
+          <w:tab w:val="left" w:pos="11908"/>
+          <w:tab w:val="left" w:pos="12824"/>
+          <w:tab w:val="left" w:pos="13740"/>
+          <w:tab w:val="left" w:pos="14656"/>
+        </w:tabs>
+        <w:wordWrap w:val="0"/>
+        <w:rPr>
+          <w:rFonts w:ascii="var(--ds-font-family-code)" w:eastAsia="Times New Roman" w:hAnsi="var(--ds-font-family-code)" w:cs="Courier New"/>
+          <w:color w:val="0F1115"/>
+          <w:sz w:val="20"/>
+          <w:szCs w:val="20"/>
+          <w:lang w:eastAsia="en-GB"/>
+        </w:rPr>
+      </w:pPr>
+      <w:r>
+        <w:rPr>
+          <w:rFonts w:ascii="var(--ds-font-family-code)" w:eastAsia="Times New Roman" w:hAnsi="var(--ds-font-family-code)" w:cs="Courier New"/>
+          <w:color w:val="0F1115"/>
+          <w:sz w:val="20"/>
+          <w:szCs w:val="20"/>
+          <w:lang w:eastAsia="en-GB"/>
+        </w:rPr>
+        <w:t>1. Introduction to Cloud Security and Misconfigurations</w:t>
+      </w:r>
+    </w:p>
+    <w:p>
+      <w:pPr>
+        <w:tabs>
+          <w:tab w:val="left" w:pos="916"/>
+          <w:tab w:val="left" w:pos="1832"/>
+          <w:tab w:val="left" w:pos="2748"/>
+          <w:tab w:val="left" w:pos="3664"/>
+          <w:tab w:val="left" w:pos="4580"/>
+          <w:tab w:val="left" w:pos="5496"/>
+          <w:tab w:val="left" w:pos="6412"/>
+          <w:tab w:val="left" w:pos="7328"/>
+          <w:tab w:val="left" w:pos="8244"/>
+          <w:tab w:val="left" w:pos="9160"/>
+          <w:tab w:val="left" w:pos="10076"/>
+          <w:tab w:val="left" w:pos="10992"/>
+          <w:tab w:val="left" w:pos="11908"/>
+          <w:tab w:val="left" w:pos="12824"/>
+          <w:tab w:val="left" w:pos="13740"/>
+          <w:tab w:val="left" w:pos="14656"/>
+        </w:tabs>
+        <w:wordWrap w:val="0"/>
+        <w:rPr>
+          <w:rFonts w:ascii="var(--ds-font-family-code)" w:eastAsia="Times New Roman" w:hAnsi="var(--ds-font-family-code)" w:cs="Courier New"/>
+          <w:color w:val="0F1115"/>
+          <w:sz w:val="20"/>
+          <w:szCs w:val="20"/>
+          <w:lang w:eastAsia="en-GB"/>
+        </w:rPr>
+      </w:pPr>
+    </w:p>
+    <w:p>
+      <w:pPr>
+        <w:tabs>
+          <w:tab w:val="left" w:pos="916"/>
+          <w:tab w:val="left" w:pos="1832"/>
+          <w:tab w:val="left" w:pos="2748"/>
+          <w:tab w:val="left" w:pos="3664"/>
+          <w:tab w:val="left" w:pos="4580"/>
+          <w:tab w:val="left" w:pos="5496"/>
+          <w:tab w:val="left" w:pos="6412"/>
+          <w:tab w:val="left" w:pos="7328"/>
+          <w:tab w:val="left" w:pos="8244"/>
+          <w:tab w:val="left" w:pos="9160"/>
+          <w:tab w:val="left" w:pos="10076"/>
+          <w:tab w:val="left" w:pos="10992"/>
+          <w:tab w:val="left" w:pos="11908"/>
+          <w:tab w:val="left" w:pos="12824"/>
+          <w:tab w:val="left" w:pos="13740"/>
+          <w:tab w:val="left" w:pos="14656"/>
+        </w:tabs>
+        <w:wordWrap w:val="0"/>
+        <w:rPr>
+          <w:rFonts w:ascii="var(--ds-font-family-code)" w:eastAsia="Times New Roman" w:hAnsi="var(--ds-font-family-code)" w:cs="Courier New"/>
+          <w:color w:val="0F1115"/>
+          <w:sz w:val="20"/>
+          <w:szCs w:val="20"/>
+          <w:lang w:eastAsia="en-GB"/>
+        </w:rPr>
+      </w:pPr>
+      <w:r>
+        <w:rPr>
+          <w:rFonts w:ascii="var(--ds-font-family-code)" w:eastAsia="Times New Roman" w:hAnsi="var(--ds-font-family-code)" w:cs="Courier New"/>
+          <w:color w:val="0F1115"/>
+          <w:sz w:val="20"/>
+          <w:szCs w:val="20"/>
+          <w:lang w:eastAsia="en-GB"/>
+        </w:rPr>
+        <w:t>Cloud computing has become essential for modern applications, but misconfigurations remain a major security risk. A misconfiguration occurs when a cloud resource – such as an S3 bucket or IAM role – is set up with insecure settings, for example public read access or missing encryption (Author, Year). These mistakes are a leading cause of data breaches. According to recent studies, misconfigurations account for a significant percentage of cloud security incidents (Author, Year).</w:t>
+      </w:r>
+    </w:p>
+    <w:p>
+      <w:pPr>
+        <w:tabs>
+          <w:tab w:val="left" w:pos="916"/>
+          <w:tab w:val="left" w:pos="1832"/>
+          <w:tab w:val="left" w:pos="2748"/>
+          <w:tab w:val="left" w:pos="3664"/>
+          <w:tab w:val="left" w:pos="4580"/>
+          <w:tab w:val="left" w:pos="5496"/>
+          <w:tab w:val="left" w:pos="6412"/>
+          <w:tab w:val="left" w:pos="7328"/>
+          <w:tab w:val="left" w:pos="8244"/>
+          <w:tab w:val="left" w:pos="9160"/>
+          <w:tab w:val="left" w:pos="10076"/>
+          <w:tab w:val="left" w:pos="10992"/>
+          <w:tab w:val="left" w:pos="11908"/>
+          <w:tab w:val="left" w:pos="12824"/>
+          <w:tab w:val="left" w:pos="13740"/>
+          <w:tab w:val="left" w:pos="14656"/>
+        </w:tabs>
+        <w:wordWrap w:val="0"/>
+        <w:rPr>
+          <w:rFonts w:ascii="var(--ds-font-family-code)" w:eastAsia="Times New Roman" w:hAnsi="var(--ds-font-family-code)" w:cs="Courier New"/>
+          <w:color w:val="0F1115"/>
+          <w:sz w:val="20"/>
+          <w:szCs w:val="20"/>
+          <w:lang w:eastAsia="en-GB"/>
+        </w:rPr>
+      </w:pPr>
+    </w:p>
+    <w:p>
+      <w:pPr>
+        <w:tabs>
+          <w:tab w:val="left" w:pos="916"/>
+          <w:tab w:val="left" w:pos="1832"/>
+          <w:tab w:val="left" w:pos="2748"/>
+          <w:tab w:val="left" w:pos="3664"/>
+          <w:tab w:val="left" w:pos="4580"/>
+          <w:tab w:val="left" w:pos="5496"/>
+          <w:tab w:val="left" w:pos="6412"/>
+          <w:tab w:val="left" w:pos="7328"/>
+          <w:tab w:val="left" w:pos="8244"/>
+          <w:tab w:val="left" w:pos="9160"/>
+          <w:tab w:val="left" w:pos="10076"/>
+          <w:tab w:val="left" w:pos="10992"/>
+          <w:tab w:val="left" w:pos="11908"/>
+          <w:tab w:val="left" w:pos="12824"/>
+          <w:tab w:val="left" w:pos="13740"/>
+          <w:tab w:val="left" w:pos="14656"/>
+        </w:tabs>
+        <w:wordWrap w:val="0"/>
+        <w:rPr>
+          <w:rFonts w:ascii="var(--ds-font-family-code)" w:eastAsia="Times New Roman" w:hAnsi="var(--ds-font-family-code)" w:cs="Courier New"/>
+          <w:color w:val="0F1115"/>
+          <w:sz w:val="20"/>
+          <w:szCs w:val="20"/>
+          <w:lang w:eastAsia="en-GB"/>
+        </w:rPr>
+      </w:pPr>
+      <w:r>
+        <w:rPr>
+          <w:rFonts w:ascii="var(--ds-font-family-code)" w:eastAsia="Times New Roman" w:hAnsi="var(--ds-font-family-code)" w:cs="Courier New"/>
+          <w:color w:val="0F1115"/>
+          <w:sz w:val="20"/>
+          <w:szCs w:val="20"/>
+          <w:lang w:eastAsia="en-GB"/>
+        </w:rPr>
+        <w:t>2. Infrastructure as Code and Its Security Implications</w:t>
+      </w:r>
+    </w:p>
+    <w:p>
+      <w:pPr>
+        <w:tabs>
+          <w:tab w:val="left" w:pos="916"/>
+          <w:tab w:val="left" w:pos="1832"/>
+          <w:tab w:val="left" w:pos="2748"/>
+          <w:tab w:val="left" w:pos="3664"/>
+          <w:tab w:val="left" w:pos="4580"/>
+          <w:tab w:val="left" w:pos="5496"/>
+          <w:tab w:val="left" w:pos="6412"/>
+          <w:tab w:val="left" w:pos="7328"/>
+          <w:tab w:val="left" w:pos="8244"/>
+          <w:tab w:val="left" w:pos="9160"/>
+          <w:tab w:val="left" w:pos="10076"/>
+          <w:tab w:val="left" w:pos="10992"/>
+          <w:tab w:val="left" w:pos="11908"/>
+          <w:tab w:val="left" w:pos="12824"/>
+          <w:tab w:val="left" w:pos="13740"/>
+          <w:tab w:val="left" w:pos="14656"/>
+        </w:tabs>
+        <w:wordWrap w:val="0"/>
+        <w:rPr>
+          <w:rFonts w:ascii="var(--ds-font-family-code)" w:eastAsia="Times New Roman" w:hAnsi="var(--ds-font-family-code)" w:cs="Courier New"/>
+          <w:color w:val="0F1115"/>
+          <w:sz w:val="20"/>
+          <w:szCs w:val="20"/>
+          <w:lang w:eastAsia="en-GB"/>
+        </w:rPr>
+      </w:pPr>
+    </w:p>
+    <w:p>
+      <w:pPr>
+        <w:tabs>
+          <w:tab w:val="left" w:pos="916"/>
+          <w:tab w:val="left" w:pos="1832"/>
+          <w:tab w:val="left" w:pos="2748"/>
+          <w:tab w:val="left" w:pos="3664"/>
+          <w:tab w:val="left" w:pos="4580"/>
+          <w:tab w:val="left" w:pos="5496"/>
+          <w:tab w:val="left" w:pos="6412"/>
+          <w:tab w:val="left" w:pos="7328"/>
+          <w:tab w:val="left" w:pos="8244"/>
+          <w:tab w:val="left" w:pos="9160"/>
+          <w:tab w:val="left" w:pos="10076"/>
+          <w:tab w:val="left" w:pos="10992"/>
+          <w:tab w:val="left" w:pos="11908"/>
+          <w:tab w:val="left" w:pos="12824"/>
+          <w:tab w:val="left" w:pos="13740"/>
+          <w:tab w:val="left" w:pos="14656"/>
+        </w:tabs>
+        <w:wordWrap w:val="0"/>
+        <w:rPr>
+          <w:rFonts w:ascii="var(--ds-font-family-code)" w:eastAsia="Times New Roman" w:hAnsi="var(--ds-font-family-code)" w:cs="Courier New"/>
+          <w:color w:val="0F1115"/>
+          <w:sz w:val="20"/>
+          <w:szCs w:val="20"/>
+          <w:lang w:eastAsia="en-GB"/>
+        </w:rPr>
+      </w:pPr>
+      <w:r>
+        <w:rPr>
+          <w:rFonts w:ascii="var(--ds-font-family-code)" w:eastAsia="Times New Roman" w:hAnsi="var(--ds-font-family-code)" w:cs="Courier New"/>
+          <w:color w:val="0F1115"/>
+          <w:sz w:val="20"/>
+          <w:szCs w:val="20"/>
+          <w:lang w:eastAsia="en-GB"/>
+        </w:rPr>
+        <w:t>Infrastructure as Code (</w:t>
+      </w:r>
+      <w:proofErr w:type="spellStart"/>
+      <w:r>
+        <w:rPr>
+          <w:rFonts w:ascii="var(--ds-font-family-code)" w:eastAsia="Times New Roman" w:hAnsi="var(--ds-font-family-code)" w:cs="Courier New"/>
+          <w:color w:val="0F1115"/>
+          <w:sz w:val="20"/>
+          <w:szCs w:val="20"/>
+          <w:lang w:eastAsia="en-GB"/>
+        </w:rPr>
+        <w:t>IaC</w:t>
+      </w:r>
+      <w:proofErr w:type="spellEnd"/>
+      <w:r>
+        <w:rPr>
+          <w:rFonts w:ascii="var(--ds-font-family-code)" w:eastAsia="Times New Roman" w:hAnsi="var(--ds-font-family-code)" w:cs="Courier New"/>
+          <w:color w:val="0F1115"/>
+          <w:sz w:val="20"/>
+          <w:szCs w:val="20"/>
+          <w:lang w:eastAsia="en-GB"/>
+        </w:rPr>
+        <w:t>) tools like Terraform allow developers to define cloud resources using code. While this brings benefits like version control and automation, it also introduces security risks. Developers may accidentally write code that creates publicly accessible storage or over</w:t>
       </w:r>
       <w:r>
         <w:rPr>
-          <w:rStyle w:val="Strong"/>
-          <w:rFonts w:ascii="Arial" w:hAnsi="Arial" w:cs="Arial"/>
-          <w:color w:val="0F1115"/>
-        </w:rPr>
-        <w:t>. Introduction to Cloud Security and Misconfigurations</w:t>
+          <w:rFonts w:ascii="var(--ds-font-family-code)" w:eastAsia="Times New Roman" w:hAnsi="var(--ds-font-family-code)" w:cs="Courier New"/>
+          <w:color w:val="0F1115"/>
+          <w:sz w:val="20"/>
+          <w:szCs w:val="20"/>
+          <w:lang w:eastAsia="en-GB"/>
+        </w:rPr>
+        <w:noBreakHyphen/>
+        <w:t xml:space="preserve">permissive IAM policies (Author, Year). Therefore, scanning </w:t>
+      </w:r>
+      <w:proofErr w:type="spellStart"/>
+      <w:r>
+        <w:rPr>
+          <w:rFonts w:ascii="var(--ds-font-family-code)" w:eastAsia="Times New Roman" w:hAnsi="var(--ds-font-family-code)" w:cs="Courier New"/>
+          <w:color w:val="0F1115"/>
+          <w:sz w:val="20"/>
+          <w:szCs w:val="20"/>
+          <w:lang w:eastAsia="en-GB"/>
+        </w:rPr>
+        <w:t>IaC</w:t>
+      </w:r>
+      <w:proofErr w:type="spellEnd"/>
+      <w:r>
+        <w:rPr>
+          <w:rFonts w:ascii="var(--ds-font-family-code)" w:eastAsia="Times New Roman" w:hAnsi="var(--ds-font-family-code)" w:cs="Courier New"/>
+          <w:color w:val="0F1115"/>
+          <w:sz w:val="20"/>
+          <w:szCs w:val="20"/>
+          <w:lang w:eastAsia="en-GB"/>
+        </w:rPr>
+        <w:t xml:space="preserve"> files for security issues is critical.</w:t>
       </w:r>
     </w:p>
     <w:p>
@@ -34,20 +382,8 @@
         <w:pStyle w:val="ds-markdown-paragraph"/>
         <w:shd w:val="clear" w:color="auto" w:fill="FFFFFF"/>
         <w:spacing w:before="240" w:beforeAutospacing="0" w:after="240" w:afterAutospacing="0"/>
-        <w:rPr>
-          <w:rFonts w:ascii="Arial" w:hAnsi="Arial" w:cs="Arial"/>
-          <w:color w:val="0F1115"/>
-        </w:rPr>
       </w:pPr>
-      <w:r>
-        <w:rPr>
-          <w:rFonts w:ascii="Arial" w:hAnsi="Arial" w:cs="Arial"/>
-          <w:color w:val="0F1115"/>
-        </w:rPr>
-        <w:t>Cloud computing has transformed how organisations deploy and scale applications. However, the speed and flexibility of cloud platforms have introduced a persistent security challenge: misconfigurations </w:t>
-      </w:r>
     </w:p>
-    <w:p/>
     <w:sectPr>
       <w:type w:val="continuous"/>
       <w:pgSz w:w="11906" w:h="16838"/>
@@ -507,6 +843,55 @@
       <w:bCs/>
     </w:rPr>
   </w:style>
+  <w:style w:type="paragraph" w:styleId="HTMLPreformatted">
+    <w:name w:val="HTML Preformatted"/>
+    <w:basedOn w:val="Normal"/>
+    <w:link w:val="HTMLPreformattedChar"/>
+    <w:uiPriority w:val="99"/>
+    <w:semiHidden/>
+    <w:unhideWhenUsed/>
+    <w:rsid w:val="0045053C"/>
+    <w:pPr>
+      <w:tabs>
+        <w:tab w:val="left" w:pos="916"/>
+        <w:tab w:val="left" w:pos="1832"/>
+        <w:tab w:val="left" w:pos="2748"/>
+        <w:tab w:val="left" w:pos="3664"/>
+        <w:tab w:val="left" w:pos="4580"/>
+        <w:tab w:val="left" w:pos="5496"/>
+        <w:tab w:val="left" w:pos="6412"/>
+        <w:tab w:val="left" w:pos="7328"/>
+        <w:tab w:val="left" w:pos="8244"/>
+        <w:tab w:val="left" w:pos="9160"/>
+        <w:tab w:val="left" w:pos="10076"/>
+        <w:tab w:val="left" w:pos="10992"/>
+        <w:tab w:val="left" w:pos="11908"/>
+        <w:tab w:val="left" w:pos="12824"/>
+        <w:tab w:val="left" w:pos="13740"/>
+        <w:tab w:val="left" w:pos="14656"/>
+      </w:tabs>
+    </w:pPr>
+    <w:rPr>
+      <w:rFonts w:ascii="Courier New" w:eastAsia="Times New Roman" w:hAnsi="Courier New" w:cs="Courier New"/>
+      <w:sz w:val="20"/>
+      <w:szCs w:val="20"/>
+      <w:lang w:eastAsia="en-GB"/>
+    </w:rPr>
+  </w:style>
+  <w:style w:type="character" w:customStyle="1" w:styleId="HTMLPreformattedChar">
+    <w:name w:val="HTML Preformatted Char"/>
+    <w:basedOn w:val="DefaultParagraphFont"/>
+    <w:link w:val="HTMLPreformatted"/>
+    <w:uiPriority w:val="99"/>
+    <w:semiHidden/>
+    <w:rsid w:val="0045053C"/>
+    <w:rPr>
+      <w:rFonts w:ascii="Courier New" w:eastAsia="Times New Roman" w:hAnsi="Courier New" w:cs="Courier New"/>
+      <w:sz w:val="20"/>
+      <w:szCs w:val="20"/>
+      <w:lang w:eastAsia="en-GB"/>
+    </w:rPr>
+  </w:style>
 </w:styles>
 </file>
 

</xml_diff>